<commit_message>
yaml files are added.
</commit_message>
<xml_diff>
--- a/Project.docx
+++ b/Project.docx
@@ -167,6 +167,266 @@
           <w:u w:val="single"/>
         </w:rPr>
       </w:pPr>
+      <w:r>
+        <w:rPr>
+          <w:u w:val="single"/>
+        </w:rPr>
+        <w:drawing>
+          <wp:inline distT="0" distB="0" distL="0" distR="0" wp14:anchorId="22EDC406" wp14:editId="1823ADEE">
+            <wp:extent cx="5731510" cy="1076960"/>
+            <wp:effectExtent l="0" t="0" r="2540" b="8890"/>
+            <wp:docPr id="1943624251" name="Picture 1"/>
+            <wp:cNvGraphicFramePr>
+              <a:graphicFrameLocks xmlns:a="http://schemas.openxmlformats.org/drawingml/2006/main" noChangeAspect="1"/>
+            </wp:cNvGraphicFramePr>
+            <a:graphic xmlns:a="http://schemas.openxmlformats.org/drawingml/2006/main">
+              <a:graphicData uri="http://schemas.openxmlformats.org/drawingml/2006/picture">
+                <pic:pic xmlns:pic="http://schemas.openxmlformats.org/drawingml/2006/picture">
+                  <pic:nvPicPr>
+                    <pic:cNvPr id="1943624251" name=""/>
+                    <pic:cNvPicPr/>
+                  </pic:nvPicPr>
+                  <pic:blipFill>
+                    <a:blip r:embed="rId5"/>
+                    <a:stretch>
+                      <a:fillRect/>
+                    </a:stretch>
+                  </pic:blipFill>
+                  <pic:spPr>
+                    <a:xfrm>
+                      <a:off x="0" y="0"/>
+                      <a:ext cx="5731510" cy="1076960"/>
+                    </a:xfrm>
+                    <a:prstGeom prst="rect">
+                      <a:avLst/>
+                    </a:prstGeom>
+                  </pic:spPr>
+                </pic:pic>
+              </a:graphicData>
+            </a:graphic>
+          </wp:inline>
+        </w:drawing>
+      </w:r>
+    </w:p>
+    <w:p>
+      <w:r>
+        <w:t>Docker-compose up –-build  : microservices are created.</w:t>
+      </w:r>
+    </w:p>
+    <w:p>
+      <w:r>
+        <w:drawing>
+          <wp:inline distT="0" distB="0" distL="0" distR="0" wp14:anchorId="3B43696F" wp14:editId="10134164">
+            <wp:extent cx="5731510" cy="1312545"/>
+            <wp:effectExtent l="0" t="0" r="2540" b="1905"/>
+            <wp:docPr id="1282292401" name="Picture 1"/>
+            <wp:cNvGraphicFramePr>
+              <a:graphicFrameLocks xmlns:a="http://schemas.openxmlformats.org/drawingml/2006/main" noChangeAspect="1"/>
+            </wp:cNvGraphicFramePr>
+            <a:graphic xmlns:a="http://schemas.openxmlformats.org/drawingml/2006/main">
+              <a:graphicData uri="http://schemas.openxmlformats.org/drawingml/2006/picture">
+                <pic:pic xmlns:pic="http://schemas.openxmlformats.org/drawingml/2006/picture">
+                  <pic:nvPicPr>
+                    <pic:cNvPr id="1282292401" name=""/>
+                    <pic:cNvPicPr/>
+                  </pic:nvPicPr>
+                  <pic:blipFill>
+                    <a:blip r:embed="rId6"/>
+                    <a:stretch>
+                      <a:fillRect/>
+                    </a:stretch>
+                  </pic:blipFill>
+                  <pic:spPr>
+                    <a:xfrm>
+                      <a:off x="0" y="0"/>
+                      <a:ext cx="5731510" cy="1312545"/>
+                    </a:xfrm>
+                    <a:prstGeom prst="rect">
+                      <a:avLst/>
+                    </a:prstGeom>
+                  </pic:spPr>
+                </pic:pic>
+              </a:graphicData>
+            </a:graphic>
+          </wp:inline>
+        </w:drawing>
+      </w:r>
+    </w:p>
+    <w:p>
+      <w:r>
+        <w:t>Minikube latest imaged loaded and K8s yaml applied.</w:t>
+      </w:r>
+    </w:p>
+    <w:p>
+      <w:r>
+        <w:drawing>
+          <wp:inline distT="0" distB="0" distL="0" distR="0" wp14:anchorId="738382CC" wp14:editId="14B988EA">
+            <wp:extent cx="5731510" cy="2518410"/>
+            <wp:effectExtent l="0" t="0" r="2540" b="0"/>
+            <wp:docPr id="1951530163" name="Picture 1"/>
+            <wp:cNvGraphicFramePr>
+              <a:graphicFrameLocks xmlns:a="http://schemas.openxmlformats.org/drawingml/2006/main" noChangeAspect="1"/>
+            </wp:cNvGraphicFramePr>
+            <a:graphic xmlns:a="http://schemas.openxmlformats.org/drawingml/2006/main">
+              <a:graphicData uri="http://schemas.openxmlformats.org/drawingml/2006/picture">
+                <pic:pic xmlns:pic="http://schemas.openxmlformats.org/drawingml/2006/picture">
+                  <pic:nvPicPr>
+                    <pic:cNvPr id="1951530163" name=""/>
+                    <pic:cNvPicPr/>
+                  </pic:nvPicPr>
+                  <pic:blipFill>
+                    <a:blip r:embed="rId7"/>
+                    <a:stretch>
+                      <a:fillRect/>
+                    </a:stretch>
+                  </pic:blipFill>
+                  <pic:spPr>
+                    <a:xfrm>
+                      <a:off x="0" y="0"/>
+                      <a:ext cx="5731510" cy="2518410"/>
+                    </a:xfrm>
+                    <a:prstGeom prst="rect">
+                      <a:avLst/>
+                    </a:prstGeom>
+                  </pic:spPr>
+                </pic:pic>
+              </a:graphicData>
+            </a:graphic>
+          </wp:inline>
+        </w:drawing>
+      </w:r>
+    </w:p>
+    <w:p/>
+    <w:p>
+      <w:r>
+        <w:t>Validating Services:</w:t>
+      </w:r>
+    </w:p>
+    <w:p>
+      <w:r>
+        <w:lastRenderedPageBreak/>
+        <w:drawing>
+          <wp:inline distT="0" distB="0" distL="0" distR="0" wp14:anchorId="71B3B5D6" wp14:editId="17F99CAF">
+            <wp:extent cx="5731510" cy="3535045"/>
+            <wp:effectExtent l="0" t="0" r="2540" b="8255"/>
+            <wp:docPr id="1327788253" name="Picture 1"/>
+            <wp:cNvGraphicFramePr>
+              <a:graphicFrameLocks xmlns:a="http://schemas.openxmlformats.org/drawingml/2006/main" noChangeAspect="1"/>
+            </wp:cNvGraphicFramePr>
+            <a:graphic xmlns:a="http://schemas.openxmlformats.org/drawingml/2006/main">
+              <a:graphicData uri="http://schemas.openxmlformats.org/drawingml/2006/picture">
+                <pic:pic xmlns:pic="http://schemas.openxmlformats.org/drawingml/2006/picture">
+                  <pic:nvPicPr>
+                    <pic:cNvPr id="1327788253" name=""/>
+                    <pic:cNvPicPr/>
+                  </pic:nvPicPr>
+                  <pic:blipFill>
+                    <a:blip r:embed="rId8"/>
+                    <a:stretch>
+                      <a:fillRect/>
+                    </a:stretch>
+                  </pic:blipFill>
+                  <pic:spPr>
+                    <a:xfrm>
+                      <a:off x="0" y="0"/>
+                      <a:ext cx="5731510" cy="3535045"/>
+                    </a:xfrm>
+                    <a:prstGeom prst="rect">
+                      <a:avLst/>
+                    </a:prstGeom>
+                  </pic:spPr>
+                </pic:pic>
+              </a:graphicData>
+            </a:graphic>
+          </wp:inline>
+        </w:drawing>
+      </w:r>
+    </w:p>
+    <w:p/>
+    <w:p>
+      <w:r>
+        <w:t>Inspecting service logs</w:t>
+      </w:r>
+      <w:r>
+        <w:t>:</w:t>
+      </w:r>
+    </w:p>
+    <w:p>
+      <w:r>
+        <w:drawing>
+          <wp:inline distT="0" distB="0" distL="0" distR="0" wp14:anchorId="70C31DE8" wp14:editId="48B86FA3">
+            <wp:extent cx="5731510" cy="654050"/>
+            <wp:effectExtent l="0" t="0" r="2540" b="0"/>
+            <wp:docPr id="1852798629" name="Picture 1"/>
+            <wp:cNvGraphicFramePr>
+              <a:graphicFrameLocks xmlns:a="http://schemas.openxmlformats.org/drawingml/2006/main" noChangeAspect="1"/>
+            </wp:cNvGraphicFramePr>
+            <a:graphic xmlns:a="http://schemas.openxmlformats.org/drawingml/2006/main">
+              <a:graphicData uri="http://schemas.openxmlformats.org/drawingml/2006/picture">
+                <pic:pic xmlns:pic="http://schemas.openxmlformats.org/drawingml/2006/picture">
+                  <pic:nvPicPr>
+                    <pic:cNvPr id="1852798629" name=""/>
+                    <pic:cNvPicPr/>
+                  </pic:nvPicPr>
+                  <pic:blipFill>
+                    <a:blip r:embed="rId9"/>
+                    <a:stretch>
+                      <a:fillRect/>
+                    </a:stretch>
+                  </pic:blipFill>
+                  <pic:spPr>
+                    <a:xfrm>
+                      <a:off x="0" y="0"/>
+                      <a:ext cx="5731510" cy="654050"/>
+                    </a:xfrm>
+                    <a:prstGeom prst="rect">
+                      <a:avLst/>
+                    </a:prstGeom>
+                  </pic:spPr>
+                </pic:pic>
+              </a:graphicData>
+            </a:graphic>
+          </wp:inline>
+        </w:drawing>
+      </w:r>
+    </w:p>
+    <w:p/>
+    <w:p>
+      <w:r>
+        <w:t>Enabling the Ingress:</w:t>
+      </w:r>
+    </w:p>
+    <w:p>
+      <w:r>
+        <w:t>PS C:\Users\arunkumar\Documents\Assignments\Microservices-Task1&gt; minikube addons enable ingress</w:t>
+      </w:r>
+    </w:p>
+    <w:p>
+      <w:r>
+        <w:rPr>
+          <w:rFonts w:ascii="Segoe UI Emoji" w:hAnsi="Segoe UI Emoji" w:cs="Segoe UI Emoji"/>
+        </w:rPr>
+        <w:t>💡</w:t>
+      </w:r>
+      <w:r>
+        <w:t xml:space="preserve">  ingress is an addon maintained by Kubernetes. For any concerns contact minikube on GitHub.</w:t>
+      </w:r>
+    </w:p>
+    <w:p>
+      <w:r>
+        <w:t>You can view the list of minikube maintainers at: https://github.com/kubernetes/minikube/blob/master/OWNERS</w:t>
+      </w:r>
+    </w:p>
+    <w:p>
+      <w:r>
+        <w:rPr>
+          <w:rFonts w:ascii="Segoe UI Emoji" w:hAnsi="Segoe UI Emoji" w:cs="Segoe UI Emoji"/>
+        </w:rPr>
+        <w:t>💡</w:t>
+      </w:r>
+      <w:r>
+        <w:t xml:space="preserve">  After the addon is enabled, please run "minikube tunnel" and your ingress resources would be available at "127.0.0.1</w:t>
+      </w:r>
     </w:p>
     <w:p/>
     <w:sectPr>

</xml_diff>